<commit_message>
Garmin: rescored 61 after WordPress, AP style, published samples confirmed; profile adds writing/sports facts
Co-Authored-By: Claude Opus 5.5 <noreply@anthropic.com>
Claude-Session: https://claude.ai/code/session_01Tym7Ffe6DkggR3nyAN5h24
</commit_message>
<xml_diff>
--- a/applications/garmin-senior-content-marketing-specialist/Garmin-SeniorContentMarketing-Resume.docx
+++ b/applications/garmin-senior-content-marketing-specialist/Garmin-SeniorContentMarketing-Resume.docx
@@ -753,7 +753,7 @@
           <w:i w:val="0"/>
           <w:color w:val="1A1A1A"/>
         </w:rPr>
-        <w:t>Long- &amp; Short-Form Writing, Content Strategy, Email Content &amp; Newsletters, Direct-Response Copy, Technical-to-Plain-Language Translation</w:t>
+        <w:t>Long- &amp; Short-Form Writing, AP Style, Content Strategy, Email Content &amp; Newsletters, Direct-Response Copy, Technical-to-Plain-Language Translation</w:t>
       </w:r>
     </w:p>
     <w:p>
@@ -799,7 +799,7 @@
           <w:i w:val="0"/>
           <w:color w:val="1A1A1A"/>
         </w:rPr>
-        <w:t>Microsoft Office, HubSpot, Mailchimp, Marketo, Screaming Frog, Ahrefs, Semrush</w:t>
+        <w:t>WordPress, Microsoft Office, HubSpot, Mailchimp, Marketo, Screaming Frog, Ahrefs, Semrush</w:t>
       </w:r>
     </w:p>
     <w:p>

</xml_diff>